<commit_message>
chore: sync pipeline events, Aquatic Capital tracker, and the quant resume
</commit_message>
<xml_diff>
--- a/resume/quant/two-page/Shreejit Verma Resume.docx
+++ b/resume/quant/two-page/Shreejit Verma Resume.docx
@@ -3398,6 +3398,15 @@
           <w:szCs w:val="20"/>
         </w:rPr>
         <w:t>36 Full-Time Equivalents (FTE</w:t>
+      </w:r>
+      <w:r>
+        <w:rPr>
+          <w:rFonts w:ascii="Times New Roman" w:hAnsi="Times New Roman" w:cs="Times New Roman"/>
+          <w:b/>
+          <w:sz w:val="20"/>
+          <w:szCs w:val="20"/>
+        </w:rPr>
+        <w:t>s</w:t>
       </w:r>
       <w:r>
         <w:rPr>

</xml_diff>